<commit_message>
Format manuscript for Research Policy; fix PR #333 review items (relative figure paths, PPTX decimals, proximity definition)
Co-Authored-By: Tatsuki Onishi <bougtoir@gmail.com>
</commit_message>
<xml_diff>
--- a/researcher_mobility_ode/docs/manuscript.docx
+++ b/researcher_mobility_ode/docs/manuscript.docx
@@ -9,34 +9,6 @@
       </w:pPr>
       <w:r>
         <w:t>Quantifying the Point of No Return in Global AI/ML Research Communities</w:t>
-      </w:r>
-    </w:p>
-    <w:p>
-      <w:pPr>
-        <w:pStyle w:val="Heading1"/>
-      </w:pPr>
-      <w:r>
-        <w:t>Abstract</w:t>
-      </w:r>
-    </w:p>
-    <w:p>
-      <w:r>
-        <w:t xml:space="preserve">International mobility can concentrate AI/ML researchers in a few regions, raising the risk that smaller research communities fall below a minimum viable coauthor pool and cannot recover. </w:t>
-      </w:r>
-      <w:r>
-        <w:t xml:space="preserve">We model each civilisation as a six-compartment system of domestic and abroad early-career, high-impact, and principal-investigator researchers, and estimate transition rates from OpenAlex Artificial Intelligence works (subfield 1702). </w:t>
-      </w:r>
-      <w:r>
-        <w:t xml:space="preserve">The minimum viable coauthor threshold is defined as M = k × c_bar, where c_bar is the mean number of authors per work and k is the median number of distinct last-author groups observed per recent year. </w:t>
-      </w:r>
-      <w:r>
-        <w:t xml:space="preserve">Across 9 groups, equilibrium domestic active pools T remain above M, but the closest point of no return is observed for the Japanese group, where a 1.58-fold change in d would drive the pool to its threshold. </w:t>
-      </w:r>
-      <w:r>
-        <w:t xml:space="preserve">The largest positive leverage comes from PI-driven inflow and the conversion of high-impact researchers into PIs, while the dominant negative leverage is researcher dropout. </w:t>
-      </w:r>
-      <w:r>
-        <w:t>These results provide a quantitative framework for early, safety-factor-bound interventions that preserve civilisational diversity in AI/ML research.</w:t>
       </w:r>
     </w:p>
     <w:p>
@@ -145,7 +117,7 @@
     </w:p>
     <w:p>
       <w:r>
-        <w:t>We computed elasticities by perturbing each transition rate by 1% and re-solving the equilibrium. For point-of-no-return analysis we scaled each rate in turn until T reached M, recording the critical factor and its proximity (current / critical, or inverse for negative rates).</w:t>
+        <w:t>We computed elasticities by perturbing each transition rate by 1% and re-solving the equilibrium. For point-of-no-return analysis we scaled each rate in turn until T reached M, recording the critical factor and its proximity, defined as |critical factor − 1| (the proportional change in that rate required to reach the threshold).</w:t>
       </w:r>
     </w:p>
     <w:p>
@@ -2508,7 +2480,7 @@
         <w:rPr>
           <w:i/>
         </w:rPr>
-        <w:t>Figure 2. Closest point-of-no-return proximity by group. Smaller values indicate a smaller proportional change is needed to reach the threshold.</w:t>
+        <w:t>Figure 2. Closest point-of-no-return proximity by group. Smaller values indicate that a smaller proportional change in the listed rate is required to reach the threshold.</w:t>
       </w:r>
     </w:p>
     <w:p>
@@ -3026,7 +2998,7 @@
     </w:p>
     <w:p>
       <w:r>
-        <w:t>1. Momentumyy. 人材流出ではなく『遷移係数』で考える研究コミュニティの存亡. note, 2024. https://note.com/momentumyy/n/n86df5d34282d</w:t>
+        <w:t>1. Momentumyy. 人材流出ではなく『遷移係数』で考える研究コミュニティの存亡. note, 2024. https://note.com/momentumyy/n/n86df5d34282d (accessed 2024-08-09).</w:t>
       </w:r>
     </w:p>
     <w:p>

</xml_diff>